<commit_message>
Piece 7 Front matter and score minor edits made
</commit_message>
<xml_diff>
--- a/Front Matter/Template/Pieces/7_Front-Matter [To edit].docx
+++ b/Front Matter/Template/Pieces/7_Front-Matter [To edit].docx
@@ -2067,27 +2067,7 @@
           <w:szCs w:val="24"/>
           <w:lang w:val="en-US"/>
         </w:rPr>
-        <w:t xml:space="preserve">Fung has exposed to Chinese music since young, and his interest further expands into ethnic music. Being well-known for composing with mixed use of ethnic and Western instruments, and unconventional instrumentations, he has achieved several international awards: 2nd prize in </w:t>
-      </w:r>
-      <w:proofErr w:type="spellStart"/>
-      <w:r>
-        <w:rPr>
-          <w:rFonts w:ascii="Noto Serif SC" w:eastAsia="Noto Serif SC" w:hAnsi="Noto Serif SC" w:cs="Noto Serif"/>
-          <w:sz w:val="24"/>
-          <w:szCs w:val="24"/>
-          <w:lang w:val="en-US"/>
-        </w:rPr>
-        <w:t>Sayat</w:t>
-      </w:r>
-      <w:proofErr w:type="spellEnd"/>
-      <w:r>
-        <w:rPr>
-          <w:rFonts w:ascii="Noto Serif SC" w:eastAsia="Noto Serif SC" w:hAnsi="Noto Serif SC" w:cs="Noto Serif"/>
-          <w:sz w:val="24"/>
-          <w:szCs w:val="24"/>
-          <w:lang w:val="en-US"/>
-        </w:rPr>
-        <w:t xml:space="preserve"> Nova International Composition Competition (2014), </w:t>
+        <w:t xml:space="preserve">Fung has exposed to Chinese music since young, and his interest further expands into ethnic music. Being well-known for composing with mixed use of ethnic and Western instruments, and unconventional instrumentations, he has achieved several international awards: 2nd prize in Sayat Nova International Composition Competition (2014), </w:t>
       </w:r>
       <w:proofErr w:type="spellStart"/>
       <w:r>
@@ -3812,7 +3792,58 @@
       <w:r>
         <w:rPr>
           <w:rFonts w:ascii="Noto Serif SC" w:eastAsia="Noto Serif SC" w:hAnsi="Noto Serif SC" w:cs="Noto Serif" w:hint="eastAsia"/>
-          <w:color w:val="FF0000"/>
+          <w:sz w:val="20"/>
+          <w:szCs w:val="20"/>
+        </w:rPr>
+        <w:t>铝板琴</w:t>
+      </w:r>
+      <w:r>
+        <w:rPr>
+          <w:rFonts w:ascii="Noto Serif SC" w:eastAsia="Noto Serif SC" w:hAnsi="Noto Serif SC" w:cs="Noto Serif"/>
+          <w:sz w:val="20"/>
+          <w:szCs w:val="20"/>
+        </w:rPr>
+        <w:t xml:space="preserve"> Vibraphone</w:t>
+      </w:r>
+    </w:p>
+    <w:p>
+      <w:pPr>
+        <w:ind w:left="720" w:hanging="436"/>
+        <w:rPr>
+          <w:rFonts w:ascii="Noto Serif SC" w:eastAsia="Noto Serif SC" w:hAnsi="Noto Serif SC" w:cs="Noto Serif"/>
+          <w:sz w:val="21"/>
+          <w:szCs w:val="21"/>
+          <w:lang w:val="en-US"/>
+        </w:rPr>
+      </w:pPr>
+      <w:r>
+        <w:rPr>
+          <w:rFonts w:ascii="Noto Serif SC" w:eastAsia="Noto Serif SC" w:hAnsi="Noto Serif SC" w:cs="Noto Serif"/>
+          <w:sz w:val="21"/>
+          <w:szCs w:val="21"/>
+          <w:lang w:val="en-US"/>
+        </w:rPr>
+        <w:t xml:space="preserve">II: </w:t>
+      </w:r>
+      <w:r>
+        <w:rPr>
+          <w:rFonts w:ascii="Noto Serif SC" w:eastAsia="Noto Serif SC" w:hAnsi="Noto Serif SC" w:cs="Noto Serif" w:hint="eastAsia"/>
+          <w:sz w:val="21"/>
+          <w:szCs w:val="21"/>
+        </w:rPr>
+        <w:t>云锣</w:t>
+      </w:r>
+      <w:r>
+        <w:rPr>
+          <w:rFonts w:ascii="Noto Serif SC" w:eastAsia="Noto Serif SC" w:hAnsi="Noto Serif SC" w:cs="Noto Serif"/>
+          <w:sz w:val="21"/>
+          <w:szCs w:val="21"/>
+        </w:rPr>
+        <w:t xml:space="preserve"> Yunluo, </w:t>
+      </w:r>
+      <w:r>
+        <w:rPr>
+          <w:rFonts w:ascii="Noto Serif SC" w:eastAsia="Noto Serif SC" w:hAnsi="Noto Serif SC" w:cs="Noto Serif" w:hint="eastAsia"/>
           <w:sz w:val="21"/>
           <w:szCs w:val="21"/>
         </w:rPr>
@@ -3821,107 +3852,46 @@
       <w:r>
         <w:rPr>
           <w:rFonts w:ascii="Noto Serif SC" w:eastAsia="Noto Serif SC" w:hAnsi="Noto Serif SC" w:cs="Noto Serif"/>
-          <w:color w:val="FF0000"/>
+          <w:sz w:val="21"/>
+          <w:szCs w:val="21"/>
+        </w:rPr>
+        <w:t xml:space="preserve"> Vibraphone</w:t>
+      </w:r>
+    </w:p>
+    <w:p>
+      <w:pPr>
+        <w:ind w:left="720" w:hanging="436"/>
+        <w:rPr>
+          <w:rFonts w:ascii="Noto Serif SC" w:eastAsia="Noto Serif SC" w:hAnsi="Noto Serif SC" w:cs="Noto Serif"/>
+          <w:sz w:val="21"/>
+          <w:szCs w:val="21"/>
+        </w:rPr>
+      </w:pPr>
+      <w:r>
+        <w:rPr>
+          <w:rFonts w:ascii="Noto Serif SC" w:eastAsia="Noto Serif SC" w:hAnsi="Noto Serif SC" w:cs="Noto Serif"/>
+          <w:sz w:val="21"/>
+          <w:szCs w:val="21"/>
+          <w:lang w:val="en-US"/>
+        </w:rPr>
+        <w:t xml:space="preserve">III: </w:t>
+      </w:r>
+      <w:r>
+        <w:rPr>
+          <w:rFonts w:ascii="Noto Serif SC" w:eastAsia="Noto Serif SC" w:hAnsi="Noto Serif SC" w:cs="Noto Serif" w:hint="eastAsia"/>
+          <w:sz w:val="21"/>
+          <w:szCs w:val="21"/>
+        </w:rPr>
+        <w:t>大堂鼓</w:t>
+      </w:r>
+      <w:r>
+        <w:rPr>
+          <w:rFonts w:ascii="Noto Serif SC" w:eastAsia="Noto Serif SC" w:hAnsi="Noto Serif SC" w:cs="Noto Serif"/>
           <w:sz w:val="21"/>
           <w:szCs w:val="21"/>
         </w:rPr>
         <w:t xml:space="preserve"> </w:t>
       </w:r>
-      <w:r>
-        <w:rPr>
-          <w:rFonts w:ascii="Noto Serif SC" w:eastAsia="Noto Serif SC" w:hAnsi="Noto Serif SC" w:cs="Noto Serif"/>
-          <w:sz w:val="21"/>
-          <w:szCs w:val="21"/>
-        </w:rPr>
-        <w:t>Vibraphone</w:t>
-      </w:r>
-    </w:p>
-    <w:p>
-      <w:pPr>
-        <w:ind w:left="720" w:hanging="436"/>
-        <w:rPr>
-          <w:rFonts w:ascii="Noto Serif SC" w:eastAsia="Noto Serif SC" w:hAnsi="Noto Serif SC" w:cs="Noto Serif"/>
-          <w:sz w:val="21"/>
-          <w:szCs w:val="21"/>
-          <w:lang w:val="en-US"/>
-        </w:rPr>
-      </w:pPr>
-      <w:r>
-        <w:rPr>
-          <w:rFonts w:ascii="Noto Serif SC" w:eastAsia="Noto Serif SC" w:hAnsi="Noto Serif SC" w:cs="Noto Serif"/>
-          <w:sz w:val="21"/>
-          <w:szCs w:val="21"/>
-          <w:lang w:val="en-US"/>
-        </w:rPr>
-        <w:t xml:space="preserve">II: </w:t>
-      </w:r>
-      <w:r>
-        <w:rPr>
-          <w:rFonts w:ascii="Noto Serif SC" w:eastAsia="Noto Serif SC" w:hAnsi="Noto Serif SC" w:cs="Noto Serif" w:hint="eastAsia"/>
-          <w:sz w:val="21"/>
-          <w:szCs w:val="21"/>
-        </w:rPr>
-        <w:t>云锣</w:t>
-      </w:r>
-      <w:r>
-        <w:rPr>
-          <w:rFonts w:ascii="Noto Serif SC" w:eastAsia="Noto Serif SC" w:hAnsi="Noto Serif SC" w:cs="Noto Serif"/>
-          <w:sz w:val="21"/>
-          <w:szCs w:val="21"/>
-        </w:rPr>
-        <w:t xml:space="preserve"> Yunluo, </w:t>
-      </w:r>
-      <w:r>
-        <w:rPr>
-          <w:rFonts w:ascii="Noto Serif SC" w:eastAsia="Noto Serif SC" w:hAnsi="Noto Serif SC" w:cs="Noto Serif" w:hint="eastAsia"/>
-          <w:sz w:val="21"/>
-          <w:szCs w:val="21"/>
-        </w:rPr>
-        <w:t>颤音琴</w:t>
-      </w:r>
-      <w:r>
-        <w:rPr>
-          <w:rFonts w:ascii="Noto Serif SC" w:eastAsia="Noto Serif SC" w:hAnsi="Noto Serif SC" w:cs="Noto Serif"/>
-          <w:sz w:val="21"/>
-          <w:szCs w:val="21"/>
-        </w:rPr>
-        <w:t xml:space="preserve"> Vibraphone</w:t>
-      </w:r>
-    </w:p>
-    <w:p>
-      <w:pPr>
-        <w:ind w:left="720" w:hanging="436"/>
-        <w:rPr>
-          <w:rFonts w:ascii="Noto Serif SC" w:eastAsia="Noto Serif SC" w:hAnsi="Noto Serif SC" w:cs="Noto Serif"/>
-          <w:sz w:val="21"/>
-          <w:szCs w:val="21"/>
-        </w:rPr>
-      </w:pPr>
-      <w:r>
-        <w:rPr>
-          <w:rFonts w:ascii="Noto Serif SC" w:eastAsia="Noto Serif SC" w:hAnsi="Noto Serif SC" w:cs="Noto Serif"/>
-          <w:sz w:val="21"/>
-          <w:szCs w:val="21"/>
-          <w:lang w:val="en-US"/>
-        </w:rPr>
-        <w:t xml:space="preserve">III: </w:t>
-      </w:r>
-      <w:r>
-        <w:rPr>
-          <w:rFonts w:ascii="Noto Serif SC" w:eastAsia="Noto Serif SC" w:hAnsi="Noto Serif SC" w:cs="Noto Serif" w:hint="eastAsia"/>
-          <w:sz w:val="21"/>
-          <w:szCs w:val="21"/>
-        </w:rPr>
-        <w:t>大堂鼓</w:t>
-      </w:r>
-      <w:r>
-        <w:rPr>
-          <w:rFonts w:ascii="Noto Serif SC" w:eastAsia="Noto Serif SC" w:hAnsi="Noto Serif SC" w:cs="Noto Serif"/>
-          <w:sz w:val="21"/>
-          <w:szCs w:val="21"/>
-        </w:rPr>
-        <w:t xml:space="preserve"> </w:t>
-      </w:r>
       <w:proofErr w:type="spellStart"/>
       <w:r>
         <w:rPr>
@@ -3959,11 +3929,10 @@
       <w:r>
         <w:rPr>
           <w:rFonts w:ascii="Noto Serif SC" w:eastAsia="Noto Serif SC" w:hAnsi="Noto Serif SC" w:cs="Noto Serif" w:hint="eastAsia"/>
-          <w:color w:val="FF0000"/>
-          <w:sz w:val="21"/>
-          <w:szCs w:val="21"/>
-        </w:rPr>
-        <w:t>大小</w:t>
+          <w:sz w:val="21"/>
+          <w:szCs w:val="21"/>
+        </w:rPr>
+        <w:t>弹音器</w:t>
       </w:r>
       <w:r>
         <w:rPr>
@@ -5014,7 +4983,19 @@
         <w:rPr>
           <w:rFonts w:ascii="Noto Serif SC" w:eastAsia="Noto Serif SC" w:hAnsi="Noto Serif SC" w:cs="Noto Serif"/>
         </w:rPr>
-        <w:t>Numbers in parenthesis indicate recommended amount of players</w:t>
+        <w:t xml:space="preserve">Numbers in parenthesis indicate recommended </w:t>
+      </w:r>
+      <w:r>
+        <w:rPr>
+          <w:rFonts w:ascii="Noto Serif SC" w:eastAsia="Noto Serif SC" w:hAnsi="Noto Serif SC" w:cs="Noto Serif"/>
+        </w:rPr>
+        <w:t>number</w:t>
+      </w:r>
+      <w:r>
+        <w:rPr>
+          <w:rFonts w:ascii="Noto Serif SC" w:eastAsia="Noto Serif SC" w:hAnsi="Noto Serif SC" w:cs="Noto Serif"/>
+        </w:rPr>
+        <w:t xml:space="preserve"> of players</w:t>
       </w:r>
       <w:r>
         <w:rPr>

</xml_diff>